<commit_message>
feat(c05): copy ascutit G-06 (hook/WOW/MIZA reframe + exec-slides + payoff)
Feedback extern aplicat prin filtrul G-06 pe C05 DICTIONAR:
- INTRIGA/hook: 'Tabelul este curat. Dar stim ce contine?' (tensiune)
- WOW nou cu slot payoff-wow + data-wow: 'Setul nu mai este o masa
  de date. Acum are harta.' (era dump de cifre, suna a raport)
- MIZA reframe spre teritoriu cunoscut/enumerabil + nota pozitionare
  in 06-MAP (C05 = poarta T2, 'stiu ce exista?' vs C01-04 'pot avea
  incredere?')
- exec-slide 1/4/6 reformulate; slide 4 scos numele de functii
  (COUNTUNIQUE/COUNTIF -> 'Sistemul decide')
- fix drift payoff-motto (era 'Mai intai structura. Apoi orice.' din
  C01) -> motto corect C05 in slotul payoff-motto
- propagat FILM (master) -> 4 machete, round-trip consistent

Audit ZERO DRIFT 88/88. Nesting balansat. Zero em/en-dash.
https://claude.ai/code/session_01JfPF3mkJsyJRo5ipA9NsWh
</commit_message>
<xml_diff>
--- a/c05/FILM-Excel-05-Dictionar.docx
+++ b/c05/FILM-Excel-05-Dictionar.docx
@@ -68,7 +68,7 @@
           <w:rFonts w:ascii="Calibri" w:hAnsi="Calibri"/>
           <w:sz w:val="20"/>
         </w:rPr>
-        <w:t>Setul este structural curat. Acum il intrebam ce contine.</w:t>
+        <w:t>Tabelul este curat. Dar știm ce conține?</w:t>
       </w:r>
     </w:p>
     <w:p>
@@ -92,7 +92,7 @@
           <w:rFonts w:ascii="Calibri" w:hAnsi="Calibri"/>
           <w:sz w:val="20"/>
         </w:rPr>
-        <w:t>C04 a normalizat tabelul. C05 face inventarul CALITATIV: cate etichete distincte pe coloana, dictionarul exhaustiv, granularitatea atomica, tipologia coloanelor (cardinalitate mica vs mare).</w:t>
+        <w:t>C04 a normalizat tabelul. C05 transformă tabelul curat într-un teritoriu pe care îl poți enumera: câte etichete distincte pe coloană, dicționarul exhaustiv, granularitatea atomică, tipologia coloanelor (cardinalitate mică vs mare). C01-C04 răspund «pot avea încredere în set?»; C05 răspunde «știu ce există în el?».</w:t>
       </w:r>
     </w:p>
     <w:p>
@@ -140,7 +140,7 @@
           <w:rFonts w:ascii="Calibri" w:hAnsi="Calibri"/>
           <w:sz w:val="20"/>
         </w:rPr>
-        <w:t>Inventar de etichete + profil structural complet. 15 clienti, 4 categorii produs, 12 cantitati.</w:t>
+        <w:t>Setul nu mai este o masă de date. Acum are hartă.</w:t>
       </w:r>
     </w:p>
     <w:p>
@@ -231,7 +231,7 @@
           <w:b w:val="0"/>
           <w:sz w:val="20"/>
         </w:rPr>
-        <w:t>Te uiți la un tabel. Astăzi am aflat din ce categorii e de fapt făcut.</w:t>
+        <w:t>Te uitai la un tabel. Acum vezi universul lui.</w:t>
       </w:r>
     </w:p>
     <w:p>
@@ -375,7 +375,7 @@
           <w:b w:val="0"/>
           <w:sz w:val="20"/>
         </w:rPr>
-        <w:t>O etichetă presupusă nu este o etichetă confirmată. COUNTUNIQUE și COUNTIF decid.</w:t>
+        <w:t>O categorie presupusă nu este una confirmată. Sistemul decide.</w:t>
       </w:r>
     </w:p>
     <w:p>
@@ -471,7 +471,7 @@
           <w:b w:val="0"/>
           <w:sz w:val="20"/>
         </w:rPr>
-        <w:t>Era o coloană de text. De data asta, știu fiecare categorie din ea.</w:t>
+        <w:t>Datele au încetat să fie text. Au devenit cunoaștere.</w:t>
       </w:r>
     </w:p>
     <w:p>
@@ -495,7 +495,7 @@
           <w:rFonts w:ascii="Calibri" w:hAnsi="Calibri"/>
           <w:sz w:val="20"/>
         </w:rPr>
-        <w:t>Constructia 05 CLASIFICAREA DATELOR preia tabelul predat de constructia precedenta. C04 a normalizat tabelul. C05 face inventarul CALITATIV: cate etichete distincte pe coloana, dictionarul exhaustiv, granularitatea atomica, tipologia coloanelor (cardinalitate mica vs mare).</w:t>
+        <w:t>Construcția 05 CLASIFICAREA DATELOR preia tabelul predat de construcția precedentă. C04 a normalizat tabelul. C05 transformă tabelul curat într-un teritoriu pe care îl poți enumera: câte etichete distincte pe coloană, dicționarul exhaustiv, granularitatea atomică, tipologia coloanelor (cardinalitate mică vs mare).</w:t>
       </w:r>
     </w:p>
     <w:p>
@@ -507,7 +507,7 @@
           <w:rFonts w:ascii="Calibri" w:hAnsi="Calibri"/>
           <w:sz w:val="20"/>
         </w:rPr>
-        <w:t>Inventar de etichete + profil structural complet. 15 clienti, 4 categorii produs, 12 cantitati.</w:t>
+        <w:t>Setul nu mai este o masă de date. Acum are hartă.</w:t>
       </w:r>
     </w:p>
     <w:p>

</xml_diff>

<commit_message>
feat(c05): model premium (hero cockpit DICTIONAR + arc TU) + hero dedicat
Grefa premium L175 pe Studiu + Editor-Studiu (Video neatins):
- hero-visual cu imagine-obiect DICTIONAR dedicata (hero-poster-excel-05
  -dictionar.jpg, watermark Gemini scos) + overlay + system-map T2
- hero-question 'Din ce este facut acest set?'
- arc TU: BOMBA 'Tabelul este curat. Dar stim ce contine?' -> SUNA
  CUNOSCUT -> GRESEALA 'Profesionistii il enumera.' -> AHA 'Nu cunosti
  un set pana nu il poti enumera.' -> CINE DEVII 'Vezi un teritoriu.'
- before/after + outcomes; cover-miza upgradat la card (V53 pe C05)
- scos exec-hero 'DE CE C05' + cover-meta; CSS premium scoped din C01
- FILM (master) + sectiune ARC TRANSFORMARE
- verificat randat 393px + 1280px

fix(gate): premium topbar diacritic-insensitive (fold_diac) - slug ASCII
'Dictionar' vs topbar 'Dictionar' cu diacritice. C05 GATE PASS premium.

Audit ZERO DRIFT 88/88. Gate C05-C08 PASS.
https://claude.ai/code/session_01JfPF3mkJsyJRo5ipA9NsWh
</commit_message>
<xml_diff>
--- a/c05/FILM-Excel-05-Dictionar.docx
+++ b/c05/FILM-Excel-05-Dictionar.docx
@@ -165,6 +165,51 @@
           <w:sz w:val="20"/>
         </w:rPr>
         <w:t>Un set cunoscut. Apoi orice decizie.</w:t>
+      </w:r>
+    </w:p>
+    <w:p>
+      <w:r>
+        <w:t>ARC TRANSFORMARE · CINE DEVINE CURSANTUL</w:t>
+      </w:r>
+    </w:p>
+    <w:p>
+      <w:r>
+        <w:t>Stratul pedagogic din HTML-Studiu (sursa de adevar a arcului, propagat de aici). Doua voci: TU (persoana a II-a) vs DATE (tehnic).</w:t>
+      </w:r>
+    </w:p>
+    <w:p>
+      <w:r>
+        <w:t>BOMBA (idee dominanta): Tabelul este curat. Dar stim ce contine?</w:t>
+      </w:r>
+    </w:p>
+    <w:p>
+      <w:r>
+        <w:t>SUNA CUNOSCUT (recunoastere): Lucrezi cu un set predat ca fiind curat. Si totusi: iei decizii pe categorii pe care nu le-ai numarat, presupui ce valori exista intr-o coloana, afli de o eticheta noua abia cand strica un raport.</w:t>
+      </w:r>
+    </w:p>
+    <w:p>
+      <w:r>
+        <w:t>GRESEALA CLASICA: Oamenii presupun ce contine setul. Profesionistii il enumera.</w:t>
+      </w:r>
+    </w:p>
+    <w:p>
+      <w:r>
+        <w:t>AHA (varf): Nu cunosti un set pana nu il poti enumera.</w:t>
+      </w:r>
+    </w:p>
+    <w:p>
+      <w:r>
+        <w:t>CINE DEVII (promisiune): Nu mai vezi coloane. Vezi un teritoriu.</w:t>
+      </w:r>
+    </w:p>
+    <w:p>
+      <w:r>
+        <w:t>INAINTE -&gt; DUPA: categorii presupuse / valori necunoscute / set ca masa de date  -&gt;  categorii enumerate / cardinalitati cunoscute / set ca teritoriu.</w:t>
+      </w:r>
+    </w:p>
+    <w:p>
+      <w:r>
+        <w:t>CE VEI OBTINE: dictionar complet al setului, cardinalitatea fiecarei coloane, harta categoriilor, baza pentru clasificare (C06).</w:t>
       </w:r>
     </w:p>
     <w:p>

</xml_diff>

<commit_message>
docs(film-c05): sync FILM master la HTML-Studiu corectat
FILM ramasese in urma fata de curatarea HTML din aceasta sesiune:
- NUME C05: 'CLASIFICAREA DATELOR' (vechi, pre-rename V44) -> 'DICTIONARUL
  DATELOR' in 3 locuri (titlu, deschidere, final). Era si coliziune cu C06
  care e acum CLASIFICARE.
- ETAPA 4: 'AGGREGATE / formule de verificare' -> 'COUNTA(UNIQUE()) si
  COUNTIF confirma cardinalitatile si frecventele'
- ETAPA 5: 'Power Query stabilizeaza fluxul. Refresh All' -> 'Formule
  dinamice (UNIQUE, COUNTA(UNIQUE()), COUNTIF) recalculeaza automat'
- SCENA fenomen 04: '97.5% (Pareto)' headline -> 'top-3 domina volumul'

FILM=master acum aliniat cap-coada cu HTML-Studiu. Identitate/arc/WOW/
motto/slides erau deja sincronizate (G-06). Audit 96/96, gate C05 PASS.
https://claude.ai/code/session_01JfPF3mkJsyJRo5ipA9NsWh
</commit_message>
<xml_diff>
--- a/c05/FILM-Excel-05-Dictionar.docx
+++ b/c05/FILM-Excel-05-Dictionar.docx
@@ -8,7 +8,7 @@
           <w:b/>
           <w:sz w:val="44"/>
         </w:rPr>
-        <w:t>FILM · C05 CLASIFICAREA DATELOR</w:t>
+        <w:t>FILM · C05 DICȚIONARUL DATELOR</w:t>
       </w:r>
     </w:p>
     <w:p>
@@ -540,7 +540,7 @@
           <w:rFonts w:ascii="Calibri" w:hAnsi="Calibri"/>
           <w:sz w:val="20"/>
         </w:rPr>
-        <w:t>Construcția 05 CLASIFICAREA DATELOR preia tabelul predat de construcția precedentă. C04 a normalizat tabelul. C05 transformă tabelul curat într-un teritoriu pe care îl poți enumera: câte etichete distincte pe coloană, dicționarul exhaustiv, granularitatea atomică, tipologia coloanelor (cardinalitate mică vs mare).</w:t>
+        <w:t>Construcția 05 DICȚIONARUL DATELOR preia tabelul predat de construcția precedentă. C04 a normalizat tabelul. C05 transformă tabelul curat într-un teritoriu pe care îl poți enumera: câte etichete distincte pe coloană, dicționarul exhaustiv, granularitatea atomică, tipologia coloanelor (cardinalitate mică vs mare).</w:t>
       </w:r>
     </w:p>
     <w:p>
@@ -751,7 +751,7 @@
           <w:rFonts w:ascii="Calibri" w:hAnsi="Calibri"/>
           <w:sz w:val="20"/>
         </w:rPr>
-        <w:t>top-3 clienti = 97.5% din volum (Pareto)</w:t>
+        <w:t>top-3 clienti domina volumul (Pareto)</w:t>
       </w:r>
     </w:p>
     <w:p>
@@ -1476,7 +1476,7 @@
           <w:rFonts w:ascii="Calibri" w:hAnsi="Calibri"/>
           <w:sz w:val="20"/>
         </w:rPr>
-        <w:t>AGGREGATE / formule de verificare confirma martorul dupa transformare.</w:t>
+        <w:t>COUNTA(UNIQUE()) si COUNTIF confirma cardinalitatile si frecventele dupa profilare.</w:t>
       </w:r>
     </w:p>
     <w:p>
@@ -1689,7 +1689,7 @@
           <w:rFonts w:ascii="Calibri" w:hAnsi="Calibri"/>
           <w:sz w:val="20"/>
         </w:rPr>
-        <w:t>Power Query stabilizeaza fluxul. Refresh All re-aplica transformarile.</w:t>
+        <w:t>Formule dinamice (UNIQUE, COUNTA(UNIQUE()), COUNTIF) recalculeaza automat la fiecare valoare noua.</w:t>
       </w:r>
     </w:p>
     <w:p>
@@ -2102,7 +2102,7 @@
           <w:rFonts w:ascii="Calibri" w:hAnsi="Calibri"/>
           <w:sz w:val="20"/>
         </w:rPr>
-        <w:t>Pack 02 Excel · Constructia 05 CLASIFICAREA DATELOR.</w:t>
+        <w:t>Pack 02 Excel · Constructia 05 DICȚIONARUL DATELOR.</w:t>
       </w:r>
     </w:p>
     <w:p>

</xml_diff>